<commit_message>
Refactor code structure and improve documentation
</commit_message>
<xml_diff>
--- a/Manuscript/Synthetically Controlled Trials in Cancer Research.docx
+++ b/Manuscript/Synthetically Controlled Trials in Cancer Research.docx
@@ -402,16 +402,24 @@
         </w:rPr>
         <w:t>,10</w:t>
       </w:r>
+      <w:proofErr w:type="gramStart"/>
       <w:r>
         <w:rPr>
           <w:rStyle w:val="apple-converted-space"/>
         </w:rPr>
-        <w:t>]  and propensity score analyses [1</w:t>
-      </w:r>
+        <w:t>]  and</w:t>
+      </w:r>
+      <w:proofErr w:type="gramEnd"/>
       <w:r>
         <w:rPr>
           <w:rStyle w:val="apple-converted-space"/>
         </w:rPr>
+        <w:t xml:space="preserve"> propensity score analyses [1</w:t>
+      </w:r>
+      <w:r>
+        <w:rPr>
+          <w:rStyle w:val="apple-converted-space"/>
+        </w:rPr>
         <w:t>1</w:t>
       </w:r>
       <w:r>
@@ -432,6 +440,26 @@
         </w:rPr>
         <w:t>] have been used as for causal inference in place of randomisation.</w:t>
       </w:r>
+      <w:r>
+        <w:rPr>
+          <w:rStyle w:val="apple-converted-space"/>
+        </w:rPr>
+        <w:t xml:space="preserve">  In cancer research in particular Damone et al [13] explored </w:t>
+      </w:r>
+      <w:proofErr w:type="gramStart"/>
+      <w:r>
+        <w:rPr>
+          <w:rStyle w:val="apple-converted-space"/>
+        </w:rPr>
+        <w:t>a number of</w:t>
+      </w:r>
+      <w:proofErr w:type="gramEnd"/>
+      <w:r>
+        <w:rPr>
+          <w:rStyle w:val="apple-converted-space"/>
+        </w:rPr>
+        <w:t xml:space="preserve"> approaches for incorporating external controls in the proposal of ‘hybrid’ designs.</w:t>
+      </w:r>
     </w:p>
     <w:p/>
     <w:p>
@@ -554,12 +582,19 @@
         <w:rPr>
           <w:lang w:eastAsia="en-GB"/>
         </w:rPr>
-        <w:t xml:space="preserve"> they have </w:t>
+        <w:t xml:space="preserve"> </w:t>
       </w:r>
       <w:r>
         <w:rPr>
           <w:lang w:eastAsia="en-GB"/>
         </w:rPr>
+        <w:lastRenderedPageBreak/>
+        <w:t xml:space="preserve">they have </w:t>
+      </w:r>
+      <w:r>
+        <w:rPr>
+          <w:lang w:eastAsia="en-GB"/>
+        </w:rPr>
         <w:t>begun to be used as casual inference tools in areas such as cancer research</w:t>
       </w:r>
       <w:r>
@@ -610,7 +645,6 @@
         <w:rPr>
           <w:lang w:eastAsia="en-GB"/>
         </w:rPr>
-        <w:lastRenderedPageBreak/>
         <w:t>R</w:t>
       </w:r>
       <w:r>
@@ -750,29 +784,11 @@
       </w:pPr>
     </w:p>
     <w:p/>
-    <w:p/>
-    <w:p/>
-    <w:p/>
-    <w:p/>
-    <w:p>
-      <w:pPr>
-        <w:rPr>
-          <w:rFonts w:asciiTheme="majorHAnsi" w:eastAsiaTheme="majorEastAsia" w:hAnsiTheme="majorHAnsi" w:cstheme="majorBidi"/>
-          <w:color w:val="0F4761" w:themeColor="accent1" w:themeShade="BF"/>
-          <w:sz w:val="40"/>
-          <w:szCs w:val="40"/>
-        </w:rPr>
-      </w:pPr>
-      <w:r>
-        <w:br w:type="page"/>
-      </w:r>
-    </w:p>
     <w:p>
       <w:pPr>
         <w:pStyle w:val="Heading1"/>
       </w:pPr>
       <w:r>
-        <w:lastRenderedPageBreak/>
         <w:t>Methods</w:t>
       </w:r>
     </w:p>
@@ -909,19 +925,7 @@
             <w:rPr>
               <w:rFonts w:ascii="Cambria Math" w:hAnsi="Cambria Math"/>
             </w:rPr>
-            <m:t>(</m:t>
-          </m:r>
-          <m:r>
-            <w:rPr>
-              <w:rFonts w:ascii="Cambria Math" w:hAnsi="Cambria Math"/>
-            </w:rPr>
-            <m:t>0</m:t>
-          </m:r>
-          <m:r>
-            <w:rPr>
-              <w:rFonts w:ascii="Cambria Math" w:hAnsi="Cambria Math"/>
-            </w:rPr>
-            <m:t>)</m:t>
+            <m:t>(0)</m:t>
           </m:r>
         </m:oMath>
       </m:oMathPara>
@@ -1049,21 +1053,31 @@
         <w:rPr>
           <w:rFonts w:eastAsiaTheme="minorEastAsia"/>
         </w:rPr>
-        <w:t xml:space="preserve">Where the outcome will </w:t>
-      </w:r>
-      <w:proofErr w:type="spellStart"/>
+        <w:t xml:space="preserve">Where the outcome </w:t>
+      </w:r>
       <w:r>
         <w:rPr>
           <w:rFonts w:eastAsiaTheme="minorEastAsia"/>
         </w:rPr>
-        <w:t>expliclty</w:t>
-      </w:r>
-      <w:proofErr w:type="spellEnd"/>
+        <w:t>explicitly</w:t>
+      </w:r>
       <w:r>
         <w:rPr>
           <w:rFonts w:eastAsiaTheme="minorEastAsia"/>
         </w:rPr>
-        <w:t xml:space="preserve"> depends on patient characteristic as well as treatment effects we focus on the Conditional Average Treatment Effect (CATE).</w:t>
+        <w:t xml:space="preserve"> depends on patient characteristic</w:t>
+      </w:r>
+      <w:r>
+        <w:rPr>
+          <w:rFonts w:eastAsiaTheme="minorEastAsia"/>
+        </w:rPr>
+        <w:t>s, X,</w:t>
+      </w:r>
+      <w:r>
+        <w:rPr>
+          <w:rFonts w:eastAsiaTheme="minorEastAsia"/>
+        </w:rPr>
+        <w:t xml:space="preserve"> as well as treatment effects we focus on the Conditional Average Treatment Effect (CATE).</w:t>
       </w:r>
     </w:p>
     <w:p/>
@@ -1073,6 +1087,101 @@
           <w:rFonts w:eastAsiaTheme="minorEastAsia"/>
         </w:rPr>
       </w:pPr>
+      <m:oMathPara>
+        <m:oMath>
+          <m:r>
+            <w:rPr>
+              <w:rFonts w:ascii="Cambria Math" w:hAnsi="Cambria Math"/>
+            </w:rPr>
+            <m:t>CATE=E[Y</m:t>
+          </m:r>
+          <m:d>
+            <m:dPr>
+              <m:ctrlPr>
+                <w:rPr>
+                  <w:rFonts w:ascii="Cambria Math" w:hAnsi="Cambria Math"/>
+                  <w:i/>
+                </w:rPr>
+              </m:ctrlPr>
+            </m:dPr>
+            <m:e>
+              <m:r>
+                <w:rPr>
+                  <w:rFonts w:ascii="Cambria Math" w:hAnsi="Cambria Math"/>
+                </w:rPr>
+                <m:t>1</m:t>
+              </m:r>
+            </m:e>
+          </m:d>
+          <m:r>
+            <w:rPr>
+              <w:rFonts w:ascii="Cambria Math" w:hAnsi="Cambria Math"/>
+            </w:rPr>
+            <m:t>|X]- E[Y</m:t>
+          </m:r>
+          <m:d>
+            <m:dPr>
+              <m:ctrlPr>
+                <w:rPr>
+                  <w:rFonts w:ascii="Cambria Math" w:hAnsi="Cambria Math"/>
+                  <w:i/>
+                </w:rPr>
+              </m:ctrlPr>
+            </m:dPr>
+            <m:e>
+              <m:r>
+                <w:rPr>
+                  <w:rFonts w:ascii="Cambria Math" w:hAnsi="Cambria Math"/>
+                </w:rPr>
+                <m:t>0</m:t>
+              </m:r>
+            </m:e>
+          </m:d>
+          <m:r>
+            <w:rPr>
+              <w:rFonts w:ascii="Cambria Math" w:hAnsi="Cambria Math"/>
+            </w:rPr>
+            <m:t>|X]</m:t>
+          </m:r>
+        </m:oMath>
+      </m:oMathPara>
+    </w:p>
+    <w:p/>
+    <w:p>
+      <w:r>
+        <w:t xml:space="preserve">To claim a causal effect there are assumptions of </w:t>
+      </w:r>
+      <w:r>
+        <w:t>e</w:t>
+      </w:r>
+      <w:r>
+        <w:t>xchangeability</w:t>
+      </w:r>
+      <w:r>
+        <w:t>, consistency and no interference</w:t>
+      </w:r>
+      <w:r>
+        <w:t xml:space="preserve">.  </w:t>
+      </w:r>
+      <w:r>
+        <w:t xml:space="preserve">  </w:t>
+      </w:r>
+      <w:r>
+        <w:t xml:space="preserve"> </w:t>
+      </w:r>
+      <w:r>
+        <w:t xml:space="preserve">For prospective trial design, assume at the onset that information on the experimental arm is obtained from the trial but that information on the control arm exists prior to the conception of the study.   </w:t>
+      </w:r>
+      <w:r>
+        <w:t>For synthetically controlled trials only the experimental treatments outcomes are observed and outcomes for the control group are estimated, we therefore amend to:</w:t>
+      </w:r>
+    </w:p>
+    <w:p>
+      <w:r>
+        <w:t xml:space="preserve"> </w:t>
+      </w:r>
+    </w:p>
+    <w:p>
       <m:oMathPara>
         <m:oMath>
           <m:r>
@@ -1085,19 +1194,7 @@
             <w:rPr>
               <w:rFonts w:ascii="Cambria Math" w:hAnsi="Cambria Math"/>
             </w:rPr>
-            <m:t>ATE</m:t>
-          </m:r>
-          <m:r>
-            <w:rPr>
-              <w:rFonts w:ascii="Cambria Math" w:hAnsi="Cambria Math"/>
-            </w:rPr>
-            <m:t>=</m:t>
-          </m:r>
-          <m:r>
-            <w:rPr>
-              <w:rFonts w:ascii="Cambria Math" w:hAnsi="Cambria Math"/>
-            </w:rPr>
-            <m:t>E[Y</m:t>
+            <m:t>ATE=E[Y</m:t>
           </m:r>
           <m:d>
             <m:dPr>
@@ -1123,113 +1220,6 @@
             </w:rPr>
             <m:t>|X</m:t>
           </m:r>
-          <m:r>
-            <w:rPr>
-              <w:rFonts w:ascii="Cambria Math" w:hAnsi="Cambria Math"/>
-            </w:rPr>
-            <m:t>]</m:t>
-          </m:r>
-          <m:r>
-            <w:rPr>
-              <w:rFonts w:ascii="Cambria Math" w:hAnsi="Cambria Math"/>
-            </w:rPr>
-            <m:t xml:space="preserve">- </m:t>
-          </m:r>
-          <m:r>
-            <w:rPr>
-              <w:rFonts w:ascii="Cambria Math" w:hAnsi="Cambria Math"/>
-            </w:rPr>
-            <m:t>E[Y</m:t>
-          </m:r>
-          <m:d>
-            <m:dPr>
-              <m:ctrlPr>
-                <w:rPr>
-                  <w:rFonts w:ascii="Cambria Math" w:hAnsi="Cambria Math"/>
-                  <w:i/>
-                </w:rPr>
-              </m:ctrlPr>
-            </m:dPr>
-            <m:e>
-              <m:r>
-                <w:rPr>
-                  <w:rFonts w:ascii="Cambria Math" w:hAnsi="Cambria Math"/>
-                </w:rPr>
-                <m:t>0</m:t>
-              </m:r>
-            </m:e>
-          </m:d>
-          <m:r>
-            <w:rPr>
-              <w:rFonts w:ascii="Cambria Math" w:hAnsi="Cambria Math"/>
-            </w:rPr>
-            <m:t>|X</m:t>
-          </m:r>
-          <m:r>
-            <w:rPr>
-              <w:rFonts w:ascii="Cambria Math" w:hAnsi="Cambria Math"/>
-            </w:rPr>
-            <m:t>]</m:t>
-          </m:r>
-        </m:oMath>
-      </m:oMathPara>
-    </w:p>
-    <w:p/>
-    <w:p>
-      <w:r>
-        <w:t xml:space="preserve">To claim a causal effect there are assumptions of Exchangeability  and the Stable Unit Treatment Value Assumption (SUTVA).  </w:t>
-      </w:r>
-      <w:r>
-        <w:t xml:space="preserve">  </w:t>
-      </w:r>
-      <w:r>
-        <w:t xml:space="preserve"> </w:t>
-      </w:r>
-      <w:r>
-        <w:t>For prospective trial design, a</w:t>
-      </w:r>
-      <w:r>
-        <w:t xml:space="preserve">ssume at the onset that information on the experimental arm is obtained from the trial but that information on the control arm exists prior to the conception of the study.  </w:t>
-      </w:r>
-      <w:r>
-        <w:t xml:space="preserve"> </w:t>
-      </w:r>
-      <w:r>
-        <w:t>For synthetically controlled trials only the experimental treatments outcomes are observed and outcomes for the control group are estimated, we therefore amend to:</w:t>
-      </w:r>
-    </w:p>
-    <w:p>
-      <w:r>
-        <w:t xml:space="preserve"> </w:t>
-      </w:r>
-    </w:p>
-    <w:p>
-      <m:oMathPara>
-        <m:oMath>
-          <m:r>
-            <w:rPr>
-              <w:rFonts w:ascii="Cambria Math" w:hAnsi="Cambria Math"/>
-            </w:rPr>
-            <m:t>ATE=E[Y</m:t>
-          </m:r>
-          <m:d>
-            <m:dPr>
-              <m:ctrlPr>
-                <w:rPr>
-                  <w:rFonts w:ascii="Cambria Math" w:hAnsi="Cambria Math"/>
-                  <w:i/>
-                </w:rPr>
-              </m:ctrlPr>
-            </m:dPr>
-            <m:e>
-              <m:r>
-                <w:rPr>
-                  <w:rFonts w:ascii="Cambria Math" w:hAnsi="Cambria Math"/>
-                </w:rPr>
-                <m:t>1</m:t>
-              </m:r>
-            </m:e>
-          </m:d>
           <m:r>
             <w:rPr>
               <w:rFonts w:ascii="Cambria Math" w:hAnsi="Cambria Math"/>
@@ -1270,6 +1260,12 @@
                   </m:r>
                 </m:e>
               </m:d>
+              <m:r>
+                <w:rPr>
+                  <w:rFonts w:ascii="Cambria Math" w:hAnsi="Cambria Math"/>
+                </w:rPr>
+                <m:t>|X</m:t>
+              </m:r>
             </m:e>
           </m:acc>
           <m:r>
@@ -1290,10 +1286,10 @@
         <w:t xml:space="preserve"> </w:t>
       </w:r>
       <w:r>
-        <w:t>Using population averages synthetic controls</w:t>
-      </w:r>
-      <w:r>
-        <w:t>.  For both approaches we assume previous data in the form of baseline covariates X</w:t>
+        <w:t>For b</w:t>
+      </w:r>
+      <w:r>
+        <w:t>oth approaches we assume previous data in the form of baseline covariates X</w:t>
       </w:r>
       <w:r>
         <w:rPr>
@@ -1302,7 +1298,11 @@
         <w:t>SC</w:t>
       </w:r>
       <w:r>
-        <w:t xml:space="preserve"> and outcomes Y</w:t>
+        <w:t xml:space="preserve"> and outcomes </w:t>
+      </w:r>
+      <w:proofErr w:type="gramStart"/>
+      <w:r>
+        <w:t>Y</w:t>
       </w:r>
       <w:r>
         <w:rPr>
@@ -1311,7 +1311,11 @@
         <w:t>SC</w:t>
       </w:r>
       <w:r>
-        <w:t>(0)</w:t>
+        <w:t>(</w:t>
+      </w:r>
+      <w:proofErr w:type="gramEnd"/>
+      <w:r>
+        <w:t>0)</w:t>
       </w:r>
       <w:r>
         <w:t>.</w:t>
@@ -1396,13 +1400,19 @@
                       </m:r>
                     </m:e>
                   </m:d>
+                  <m:r>
+                    <w:rPr>
+                      <w:rFonts w:ascii="Cambria Math" w:hAnsi="Cambria Math"/>
+                    </w:rPr>
+                    <m:t>|X</m:t>
+                  </m:r>
                 </m:e>
               </m:acc>
             </m:e>
           </m:d>
           <m:r>
             <w:rPr>
-              <w:rFonts w:ascii="Cambria Math" w:hAnsi="Cambria Math"/>
+              <w:rFonts w:ascii="Cambria Math" w:eastAsiaTheme="minorEastAsia" w:hAnsi="Cambria Math"/>
             </w:rPr>
             <m:t xml:space="preserve">= </m:t>
           </m:r>
@@ -1513,14 +1523,92 @@
         <w:rPr>
           <w:rFonts w:eastAsiaTheme="minorEastAsia"/>
         </w:rPr>
-        <w:t xml:space="preserve">  Personalised synthetic controls act by using the control data to generate a model based on the covariates X</w:t>
+        <w:t xml:space="preserve">  Personalised synthetic controls act by </w:t>
       </w:r>
       <w:r>
         <w:rPr>
           <w:rFonts w:eastAsiaTheme="minorEastAsia"/>
         </w:rPr>
-        <w:t>.  This is then used to estimate the control outcome for each patient</w:t>
-      </w:r>
+        <w:t xml:space="preserve">first generating a ‘counter factual model’, defined as </w:t>
+      </w:r>
+      <m:oMath>
+        <m:r>
+          <w:rPr>
+            <w:rFonts w:ascii="Cambria Math" w:eastAsiaTheme="minorEastAsia" w:hAnsi="Cambria Math"/>
+          </w:rPr>
+          <m:t>f(</m:t>
+        </m:r>
+        <m:sSub>
+          <m:sSubPr>
+            <m:ctrlPr>
+              <w:rPr>
+                <w:rFonts w:ascii="Cambria Math" w:eastAsiaTheme="minorEastAsia" w:hAnsi="Cambria Math"/>
+                <w:i/>
+              </w:rPr>
+            </m:ctrlPr>
+          </m:sSubPr>
+          <m:e>
+            <m:r>
+              <w:rPr>
+                <w:rFonts w:ascii="Cambria Math" w:eastAsiaTheme="minorEastAsia" w:hAnsi="Cambria Math"/>
+              </w:rPr>
+              <m:t>X</m:t>
+            </m:r>
+          </m:e>
+          <m:sub>
+            <m:r>
+              <w:rPr>
+                <w:rFonts w:ascii="Cambria Math" w:eastAsiaTheme="minorEastAsia" w:hAnsi="Cambria Math"/>
+              </w:rPr>
+              <m:t>sc</m:t>
+            </m:r>
+          </m:sub>
+        </m:sSub>
+        <m:r>
+          <w:rPr>
+            <w:rFonts w:ascii="Cambria Math" w:eastAsiaTheme="minorEastAsia" w:hAnsi="Cambria Math"/>
+          </w:rPr>
+          <m:t>)</m:t>
+        </m:r>
+      </m:oMath>
+      <w:r>
+        <w:rPr>
+          <w:rFonts w:eastAsiaTheme="minorEastAsia"/>
+        </w:rPr>
+        <w:t xml:space="preserve">, to describe the relationship between patient characteristics and the outcome.  This is in turn </w:t>
+      </w:r>
+      <w:r>
+        <w:rPr>
+          <w:rFonts w:eastAsiaTheme="minorEastAsia"/>
+        </w:rPr>
+        <w:t>used to estimate the control outcome</w:t>
+      </w:r>
+      <w:r>
+        <w:rPr>
+          <w:rFonts w:eastAsiaTheme="minorEastAsia"/>
+        </w:rPr>
+        <w:t>s</w:t>
+      </w:r>
+      <w:r>
+        <w:rPr>
+          <w:rFonts w:eastAsiaTheme="minorEastAsia"/>
+        </w:rPr>
+        <w:t xml:space="preserve"> for each patient</w:t>
+      </w:r>
+      <w:r>
+        <w:rPr>
+          <w:rFonts w:eastAsiaTheme="minorEastAsia"/>
+        </w:rPr>
+        <w:t xml:space="preserve"> in a prospective trial based on the observed characteristics </w:t>
+      </w:r>
+      <w:proofErr w:type="gramStart"/>
+      <w:r>
+        <w:rPr>
+          <w:rFonts w:eastAsiaTheme="minorEastAsia"/>
+        </w:rPr>
+        <w:t>X;</w:t>
+      </w:r>
+      <w:proofErr w:type="gramEnd"/>
     </w:p>
     <w:p>
       <w:pPr>
@@ -1864,122 +1952,87 @@
     </w:p>
     <w:p/>
     <w:p>
+      <w:r>
+        <w:t xml:space="preserve">The causal estimand is then obtained by taking the expectation over each individual estimate of the treatment effect. </w:t>
+      </w:r>
+    </w:p>
+    <w:p/>
+    <w:p>
       <w:pPr>
         <w:rPr>
           <w:rFonts w:eastAsiaTheme="minorEastAsia"/>
         </w:rPr>
       </w:pPr>
       <w:r>
-        <w:t xml:space="preserve">The causal estimand is then obtained by taking the expectation over each individual estimate of the treatment effect.  With both </w:t>
+        <w:t>W</w:t>
+      </w:r>
+      <w:r>
+        <w:t xml:space="preserve">ith both </w:t>
       </w:r>
       <w:r>
         <w:rPr>
           <w:rFonts w:eastAsiaTheme="minorEastAsia"/>
         </w:rPr>
-        <w:t>approaches</w:t>
+        <w:t xml:space="preserve">approaches the </w:t>
       </w:r>
       <w:r>
         <w:rPr>
           <w:rFonts w:eastAsiaTheme="minorEastAsia"/>
         </w:rPr>
-        <w:t xml:space="preserve"> the source of control information can be defined prior to the start of the trial</w:t>
+        <w:t xml:space="preserve">mechanism for generating the </w:t>
       </w:r>
       <w:r>
         <w:rPr>
           <w:rFonts w:eastAsiaTheme="minorEastAsia"/>
         </w:rPr>
-        <w:t xml:space="preserve"> but the control outcome </w:t>
+        <w:t xml:space="preserve">control information can be defined prior to the start of the trial but the control outcome </w:t>
       </w:r>
       <w:r>
         <w:rPr>
           <w:rFonts w:eastAsiaTheme="minorEastAsia"/>
         </w:rPr>
-        <w:t>depend</w:t>
-      </w:r>
-      <w:r>
+        <w:t>itself is dependent on the observed characteristics of the patient population.</w:t>
+      </w:r>
+    </w:p>
+    <w:p>
+      <w:pPr>
         <w:rPr>
           <w:rFonts w:eastAsiaTheme="minorEastAsia"/>
         </w:rPr>
-        <w:t>s</w:t>
-      </w:r>
-      <w:r>
-        <w:rPr>
-          <w:rFonts w:eastAsiaTheme="minorEastAsia"/>
-        </w:rPr>
-        <w:t xml:space="preserve"> upon the population who are recruited</w:t>
-      </w:r>
-      <w:r>
-        <w:rPr>
-          <w:rFonts w:eastAsiaTheme="minorEastAsia"/>
-        </w:rPr>
-        <w:t>.  Due to this dependence the causal estimand is closer to the CATE than the ATE.</w:t>
-      </w:r>
-    </w:p>
-    <w:p>
-      <w:pPr>
-        <w:rPr>
-          <w:rFonts w:eastAsiaTheme="minorEastAsia"/>
-        </w:rPr>
-      </w:pPr>
-    </w:p>
-    <w:p>
-      <w:r>
-        <w:rPr>
-          <w:rFonts w:eastAsiaTheme="minorEastAsia"/>
-        </w:rPr>
-        <w:t xml:space="preserve">and the control outcome </w:t>
+      </w:pPr>
+    </w:p>
+    <w:p>
+      <w:pPr>
+        <w:pStyle w:val="Heading1"/>
+        <w:rPr>
+          <w:color w:val="auto"/>
+        </w:rPr>
+      </w:pPr>
+      <w:r>
+        <w:t>E</w:t>
+      </w:r>
+      <w:r>
+        <w:t xml:space="preserve">xample – </w:t>
       </w:r>
       <w:proofErr w:type="spellStart"/>
       <w:r>
-        <w:rPr>
-          <w:rFonts w:eastAsiaTheme="minorEastAsia"/>
-        </w:rPr>
-        <w:t>can not</w:t>
+        <w:t>Atezo</w:t>
       </w:r>
       <w:proofErr w:type="spellEnd"/>
       <w:r>
-        <w:rPr>
-          <w:rFonts w:eastAsiaTheme="minorEastAsia"/>
-        </w:rPr>
-        <w:t xml:space="preserve"> be defined until the experimental population has been observed. </w:t>
-      </w:r>
-    </w:p>
-    <w:p>
-      <w:r>
-        <w:t xml:space="preserve"> </w:t>
+        <w:t xml:space="preserve"> Bev in HCC</w:t>
       </w:r>
     </w:p>
     <w:p/>
+    <w:p>
+      <w:r>
+        <w:t>Simulation Study</w:t>
+      </w:r>
+    </w:p>
     <w:p/>
-    <w:p/>
-    <w:p>
-      <w:pPr>
-        <w:pStyle w:val="Heading1"/>
-        <w:rPr>
-          <w:color w:val="auto"/>
-        </w:rPr>
-      </w:pPr>
-      <w:r>
-        <w:t xml:space="preserve">Example – </w:t>
-      </w:r>
-      <w:proofErr w:type="spellStart"/>
-      <w:r>
-        <w:t>Atezo</w:t>
-      </w:r>
-      <w:proofErr w:type="spellEnd"/>
-      <w:r>
-        <w:t xml:space="preserve"> Bev in HCC</w:t>
-      </w:r>
-    </w:p>
-    <w:p/>
-    <w:p>
-      <w:r>
-        <w:t>Simulation Study</w:t>
-      </w:r>
-    </w:p>
-    <w:p/>
-    <w:p>
-      <w:r>
+    <w:p>
+      <w:r>
+        <w:lastRenderedPageBreak/>
         <w:t>Allocation ratios in randomised studies using synthetic Controls</w:t>
       </w:r>
     </w:p>
@@ -2092,6 +2145,13 @@
     <w:p/>
     <w:p/>
     <w:p/>
+    <w:p>
+      <w:r>
+        <w:t>Designing clinical trials with synthetic Controls</w:t>
+      </w:r>
+    </w:p>
+    <w:p/>
+    <w:p/>
     <w:p/>
     <w:p>
       <w:pPr>
@@ -2162,6 +2222,57 @@
         <w:t>Synthetic controls adapt to the recruited population which offer an advantage to those designs which define priors before patients are recruited.</w:t>
       </w:r>
     </w:p>
+    <w:p/>
+    <w:p>
+      <w:pPr>
+        <w:rPr>
+          <w:rFonts w:eastAsiaTheme="minorEastAsia"/>
+        </w:rPr>
+      </w:pPr>
+      <w:r>
+        <w:t xml:space="preserve">With both </w:t>
+      </w:r>
+      <w:r>
+        <w:rPr>
+          <w:rFonts w:eastAsiaTheme="minorEastAsia"/>
+        </w:rPr>
+        <w:t>approaches the mechanism for generating the control information can be defined prior to the start of the trial but the control outcome itself is dependent on the observed characteristics of the patient population.</w:t>
+      </w:r>
+      <w:r>
+        <w:rPr>
+          <w:rFonts w:eastAsiaTheme="minorEastAsia"/>
+        </w:rPr>
+        <w:t xml:space="preserve"> &lt;- Elaborate on this – better than commensurate priors and a natural experiment – using information which is known – not deriving priors on treatment effects!</w:t>
+      </w:r>
+    </w:p>
+    <w:p>
+      <w:pPr>
+        <w:rPr>
+          <w:rFonts w:eastAsiaTheme="minorEastAsia"/>
+        </w:rPr>
+      </w:pPr>
+    </w:p>
+    <w:p>
+      <w:pPr>
+        <w:rPr>
+          <w:rFonts w:eastAsiaTheme="minorEastAsia"/>
+        </w:rPr>
+      </w:pPr>
+    </w:p>
+    <w:p>
+      <w:pPr>
+        <w:rPr>
+          <w:rFonts w:eastAsiaTheme="minorEastAsia"/>
+        </w:rPr>
+      </w:pPr>
+      <w:r>
+        <w:rPr>
+          <w:rFonts w:eastAsiaTheme="minorEastAsia"/>
+        </w:rPr>
+        <w:t>Other methods tend to focus on the outcomes and not the baseline covariates!</w:t>
+      </w:r>
+    </w:p>
+    <w:p/>
     <w:p>
       <w:r>
         <w:br w:type="page"/>
@@ -3158,6 +3269,66 @@
           <w:shd w:val="clear" w:color="auto" w:fill="FFFFFF"/>
         </w:rPr>
         <w:t>[ ] Abadie A. Using synthetic controls: Feasibility, data requirements, and methodological aspects. Journal of economic literature. 2021 Jun 1;59(2):391-425.</w:t>
+      </w:r>
+    </w:p>
+    <w:p>
+      <w:pPr>
+        <w:pStyle w:val="ListParagraph"/>
+        <w:rPr>
+          <w:rFonts w:ascii="Arial" w:hAnsi="Arial" w:cs="Arial"/>
+          <w:color w:val="222222"/>
+          <w:sz w:val="20"/>
+          <w:szCs w:val="20"/>
+          <w:shd w:val="clear" w:color="auto" w:fill="FFFFFF"/>
+        </w:rPr>
+      </w:pPr>
+    </w:p>
+    <w:p>
+      <w:pPr>
+        <w:pStyle w:val="ListParagraph"/>
+        <w:numPr>
+          <w:ilvl w:val="0"/>
+          <w:numId w:val="10"/>
+        </w:numPr>
+        <w:rPr>
+          <w:rFonts w:ascii="Arial" w:hAnsi="Arial" w:cs="Arial"/>
+          <w:color w:val="222222"/>
+          <w:sz w:val="20"/>
+          <w:szCs w:val="20"/>
+          <w:shd w:val="clear" w:color="auto" w:fill="FFFFFF"/>
+        </w:rPr>
+      </w:pPr>
+      <w:r>
+        <w:rPr>
+          <w:rFonts w:ascii="Arial" w:hAnsi="Arial" w:cs="Arial"/>
+          <w:color w:val="222222"/>
+          <w:sz w:val="20"/>
+          <w:szCs w:val="20"/>
+          <w:shd w:val="clear" w:color="auto" w:fill="FFFFFF"/>
+        </w:rPr>
+        <w:t xml:space="preserve">Damone EM, Zhu J, Pang H, Li X, Zhao Y, Kwiatkowski E, Carey LA, Ibrahim JG. Incorporating external controls in the design of randomized clinical trials: a case study in solid </w:t>
+      </w:r>
+      <w:proofErr w:type="spellStart"/>
+      <w:r>
+        <w:rPr>
+          <w:rFonts w:ascii="Arial" w:hAnsi="Arial" w:cs="Arial"/>
+          <w:color w:val="222222"/>
+          <w:sz w:val="20"/>
+          <w:szCs w:val="20"/>
+          <w:shd w:val="clear" w:color="auto" w:fill="FFFFFF"/>
+        </w:rPr>
+        <w:t>tumors</w:t>
+      </w:r>
+      <w:proofErr w:type="spellEnd"/>
+      <w:r>
+        <w:rPr>
+          <w:rFonts w:ascii="Arial" w:hAnsi="Arial" w:cs="Arial"/>
+          <w:color w:val="222222"/>
+          <w:sz w:val="20"/>
+          <w:szCs w:val="20"/>
+          <w:shd w:val="clear" w:color="auto" w:fill="FFFFFF"/>
+        </w:rPr>
+        <w:t>. BMC Medical Research Methodology. 2024 Nov 1;24(1):264.</w:t>
       </w:r>
     </w:p>
     <w:p/>

</xml_diff>